<commit_message>
Add Streamlit app and new_app, update homework 4 assessment
Co-Authored-By: Claude Sonnet 5.5 <noreply@anthropic.com>
</commit_message>
<xml_diff>
--- a/04_homework/04_homework_assessment.docx
+++ b/04_homework/04_homework_assessment.docx
@@ -56,13 +56,25 @@
         <w:spacing w:after="192"/>
       </w:pPr>
       <w:r>
-        <w:t>As the quiz is coming up this week, I repeated the python fundamentals Jupyter notebook from week 2 twice</w:t>
+        <w:t xml:space="preserve">As the quiz is coming up this week, I repeated the </w:t>
+      </w:r>
+      <w:r>
+        <w:t xml:space="preserve">Python </w:t>
+      </w:r>
+      <w:r>
+        <w:t>fundamentals Jupyter notebook from week 2 twice</w:t>
       </w:r>
       <w:r>
         <w:t>.</w:t>
       </w:r>
       <w:r>
-        <w:t xml:space="preserve"> I especially concentrated on generating documents, writing text inside, reading them and how to import libraries such as math or </w:t>
+        <w:t xml:space="preserve"> I especially concentrated on generating </w:t>
+      </w:r>
+      <w:r>
+        <w:t>files</w:t>
+      </w:r>
+      <w:r>
+        <w:t xml:space="preserve">, writing text inside, reading them and how to import libraries such as math or </w:t>
       </w:r>
       <w:proofErr w:type="spellStart"/>
       <w:r>
@@ -71,26 +83,6 @@
       <w:proofErr w:type="spellEnd"/>
       <w:r>
         <w:t>.</w:t>
-      </w:r>
-    </w:p>
-    <w:p>
-      <w:pPr>
-        <w:spacing w:after="192"/>
-        <w:rPr>
-          <w:u w:val="single"/>
-        </w:rPr>
-      </w:pPr>
-      <w:r>
-        <w:rPr>
-          <w:u w:val="single"/>
-        </w:rPr>
-        <w:t>What to work on in the next weeks/what I struggle with</w:t>
-      </w:r>
-      <w:r>
-        <w:rPr>
-          <w:u w:val="single"/>
-        </w:rPr>
-        <w:t>:</w:t>
       </w:r>
     </w:p>
     <w:p>
@@ -103,13 +95,13 @@
         <w:spacing w:after="192"/>
       </w:pPr>
       <w:r>
-        <w:t xml:space="preserve">This was by far the most challenging homework so far, as I had never worked with </w:t>
-      </w:r>
-      <w:r>
-        <w:t>Pandas</w:t>
-      </w:r>
-      <w:r>
-        <w:t xml:space="preserve"> before. Therefore, the homework took much longer than in the previous weeks.</w:t>
+        <w:t xml:space="preserve">Then, I read the </w:t>
+      </w:r>
+      <w:r>
+        <w:t>Jupyter</w:t>
+      </w:r>
+      <w:r>
+        <w:t xml:space="preserve"> notebook from last class (week4_fundamentals…) to check whether I missed any topic regarding the quiz.</w:t>
       </w:r>
     </w:p>
     <w:p>
@@ -122,15 +114,7 @@
         <w:spacing w:after="192"/>
       </w:pPr>
       <w:r>
-        <w:t xml:space="preserve">The hardest part was trying to understand Pandas. In the following weeks, I would like to get a bit </w:t>
-      </w:r>
-      <w:proofErr w:type="gramStart"/>
-      <w:r>
-        <w:t>more fond</w:t>
-      </w:r>
-      <w:proofErr w:type="gramEnd"/>
-      <w:r>
-        <w:t xml:space="preserve"> of the syntax. Hopefully, this will get easier with time.</w:t>
+        <w:t>Afterwards, I completed the quiz from last year thrice, just to make sure that I properly understand everything.</w:t>
       </w:r>
     </w:p>
     <w:p>
@@ -143,13 +127,325 @@
         <w:spacing w:after="192"/>
       </w:pPr>
       <w:r>
-        <w:t xml:space="preserve">I also underestimated coming up with </w:t>
-      </w:r>
-      <w:r>
-        <w:t>a project</w:t>
-      </w:r>
-      <w:r>
-        <w:t xml:space="preserve"> idea that is a good mix between interesting and not too ambitious. It is quite hard to evaluate which ideas would be too hard for us to implement.</w:t>
+        <w:t>Apart</w:t>
+      </w:r>
+      <w:r>
+        <w:t xml:space="preserve"> </w:t>
+      </w:r>
+      <w:r>
+        <w:t xml:space="preserve">from </w:t>
+      </w:r>
+      <w:r>
+        <w:t xml:space="preserve">the first week of this course, I </w:t>
+      </w:r>
+      <w:r>
+        <w:t>had</w:t>
+      </w:r>
+      <w:r>
+        <w:t xml:space="preserve"> never used </w:t>
+      </w:r>
+      <w:proofErr w:type="spellStart"/>
+      <w:r>
+        <w:t>Streamlit</w:t>
+      </w:r>
+      <w:proofErr w:type="spellEnd"/>
+      <w:r>
+        <w:t xml:space="preserve">. I </w:t>
+      </w:r>
+      <w:proofErr w:type="gramStart"/>
+      <w:r>
+        <w:t>actually did</w:t>
+      </w:r>
+      <w:proofErr w:type="gramEnd"/>
+      <w:r>
+        <w:t xml:space="preserve"> not know that creating an app was that easy even though the one I </w:t>
+      </w:r>
+      <w:r>
+        <w:t>c</w:t>
+      </w:r>
+      <w:r>
+        <w:t>reated is rather simple.</w:t>
+      </w:r>
+    </w:p>
+    <w:p>
+      <w:pPr>
+        <w:pStyle w:val="ListParagraph"/>
+        <w:numPr>
+          <w:ilvl w:val="0"/>
+          <w:numId w:val="1"/>
+        </w:numPr>
+        <w:spacing w:after="192"/>
+      </w:pPr>
+      <w:r>
+        <w:t>I tried displaying the Disney data and added some more interesting features.</w:t>
+      </w:r>
+    </w:p>
+    <w:p>
+      <w:pPr>
+        <w:pStyle w:val="ListParagraph"/>
+        <w:numPr>
+          <w:ilvl w:val="1"/>
+          <w:numId w:val="1"/>
+        </w:numPr>
+        <w:spacing w:after="192"/>
+      </w:pPr>
+      <w:r>
+        <w:t xml:space="preserve">Some of the features include the </w:t>
+      </w:r>
+      <w:proofErr w:type="spellStart"/>
+      <w:proofErr w:type="gramStart"/>
+      <w:r>
+        <w:t>st.multiselect</w:t>
+      </w:r>
+      <w:proofErr w:type="spellEnd"/>
+      <w:proofErr w:type="gramEnd"/>
+      <w:r>
+        <w:t xml:space="preserve">() </w:t>
+      </w:r>
+      <w:r>
+        <w:t>filter</w:t>
+      </w:r>
+      <w:r>
+        <w:t xml:space="preserve"> on type or the Disney+ theme via </w:t>
+      </w:r>
+      <w:proofErr w:type="spellStart"/>
+      <w:proofErr w:type="gramStart"/>
+      <w:r>
+        <w:t>config.toml</w:t>
+      </w:r>
+      <w:proofErr w:type="spellEnd"/>
+      <w:proofErr w:type="gramEnd"/>
+      <w:r>
+        <w:t>.</w:t>
+      </w:r>
+    </w:p>
+    <w:p>
+      <w:pPr>
+        <w:pStyle w:val="ListParagraph"/>
+        <w:numPr>
+          <w:ilvl w:val="0"/>
+          <w:numId w:val="1"/>
+        </w:numPr>
+        <w:spacing w:after="192"/>
+      </w:pPr>
+      <w:r>
+        <w:t xml:space="preserve">For the data wrangling part, I reviewed the </w:t>
+      </w:r>
+      <w:r>
+        <w:t>slides from class</w:t>
+      </w:r>
+      <w:r>
+        <w:t xml:space="preserve"> and tried to understand </w:t>
+      </w:r>
+      <w:r>
+        <w:t xml:space="preserve">how to </w:t>
+      </w:r>
+      <w:r>
+        <w:t xml:space="preserve">write </w:t>
+      </w:r>
+      <w:r>
+        <w:t>pseudocod</w:t>
+      </w:r>
+      <w:r>
+        <w:t>e</w:t>
+      </w:r>
+      <w:r>
+        <w:t>, which I had not done before (</w:t>
+      </w:r>
+      <w:r>
+        <w:t>apart from</w:t>
+      </w:r>
+      <w:r>
+        <w:t xml:space="preserve"> </w:t>
+      </w:r>
+      <w:r>
+        <w:t>this class and recently</w:t>
+      </w:r>
+      <w:r>
+        <w:t xml:space="preserve"> for my bachelor’s thesis)</w:t>
+      </w:r>
+      <w:r>
+        <w:t>. I am still struggling with some concepts</w:t>
+      </w:r>
+      <w:r>
+        <w:t xml:space="preserve"> and with remembering all of them</w:t>
+      </w:r>
+      <w:r>
+        <w:t>. Hopefully, this will become easier in the next classes.</w:t>
+      </w:r>
+    </w:p>
+    <w:p>
+      <w:pPr>
+        <w:pStyle w:val="ListParagraph"/>
+        <w:numPr>
+          <w:ilvl w:val="1"/>
+          <w:numId w:val="1"/>
+        </w:numPr>
+        <w:spacing w:after="192"/>
+      </w:pPr>
+      <w:r>
+        <w:t xml:space="preserve">Pseudocode is more helpful than I had expected. It feels like coding in a more natural language. Besides, it is very helpful for writing code from scratch </w:t>
+      </w:r>
+      <w:r>
+        <w:t>when</w:t>
+      </w:r>
+      <w:r>
+        <w:t xml:space="preserve"> there is </w:t>
+      </w:r>
+      <w:r>
+        <w:t>no clear</w:t>
+      </w:r>
+      <w:r>
+        <w:t xml:space="preserve"> approach yet.</w:t>
+      </w:r>
+    </w:p>
+    <w:p>
+      <w:pPr>
+        <w:spacing w:after="192"/>
+        <w:rPr>
+          <w:u w:val="single"/>
+        </w:rPr>
+      </w:pPr>
+      <w:r>
+        <w:rPr>
+          <w:u w:val="single"/>
+        </w:rPr>
+        <w:t>What to work on in the next weeks/what I struggle with</w:t>
+      </w:r>
+      <w:r>
+        <w:rPr>
+          <w:u w:val="single"/>
+        </w:rPr>
+        <w:t>:</w:t>
+      </w:r>
+    </w:p>
+    <w:p>
+      <w:pPr>
+        <w:pStyle w:val="ListParagraph"/>
+        <w:numPr>
+          <w:ilvl w:val="0"/>
+          <w:numId w:val="1"/>
+        </w:numPr>
+        <w:spacing w:after="192"/>
+      </w:pPr>
+      <w:r>
+        <w:t>This week, I found it not necessarily hard but confusing what to repeat for the quiz next class. Maybe one slide on what to expect on the quiz could have been helpful.</w:t>
+      </w:r>
+    </w:p>
+    <w:p>
+      <w:pPr>
+        <w:pStyle w:val="ListParagraph"/>
+        <w:numPr>
+          <w:ilvl w:val="0"/>
+          <w:numId w:val="1"/>
+        </w:numPr>
+        <w:spacing w:after="192"/>
+      </w:pPr>
+      <w:r>
+        <w:t xml:space="preserve">In the next weeks, I will </w:t>
+      </w:r>
+      <w:proofErr w:type="gramStart"/>
+      <w:r>
+        <w:t>definitely have</w:t>
+      </w:r>
+      <w:proofErr w:type="gramEnd"/>
+      <w:r>
+        <w:t xml:space="preserve"> to get more comfortable with </w:t>
+      </w:r>
+      <w:proofErr w:type="spellStart"/>
+      <w:r>
+        <w:t>Streamlit</w:t>
+      </w:r>
+      <w:proofErr w:type="spellEnd"/>
+      <w:r>
+        <w:t xml:space="preserve"> as my project partner and I plan on creating a </w:t>
+      </w:r>
+      <w:proofErr w:type="spellStart"/>
+      <w:r>
+        <w:t>Streamlit</w:t>
+      </w:r>
+      <w:proofErr w:type="spellEnd"/>
+      <w:r>
+        <w:t xml:space="preserve"> app for the final project.</w:t>
+      </w:r>
+    </w:p>
+    <w:p>
+      <w:pPr>
+        <w:pStyle w:val="ListParagraph"/>
+        <w:numPr>
+          <w:ilvl w:val="1"/>
+          <w:numId w:val="1"/>
+        </w:numPr>
+        <w:spacing w:after="192"/>
+      </w:pPr>
+      <w:r>
+        <w:t xml:space="preserve">Also, I would like to know how much AI </w:t>
+      </w:r>
+      <w:r>
+        <w:t xml:space="preserve">we </w:t>
+      </w:r>
+      <w:r>
+        <w:t xml:space="preserve">will be allowed to use for the project. </w:t>
+      </w:r>
+      <w:r>
+        <w:t>Simple</w:t>
+      </w:r>
+      <w:r>
+        <w:t xml:space="preserve"> tasks are, of course, </w:t>
+      </w:r>
+      <w:r>
+        <w:t>doable</w:t>
+      </w:r>
+      <w:r>
+        <w:t xml:space="preserve"> without AI. However, depending on how complex the project will be, not using AI at all could become tricky.</w:t>
+      </w:r>
+    </w:p>
+    <w:p>
+      <w:pPr>
+        <w:pStyle w:val="ListParagraph"/>
+        <w:numPr>
+          <w:ilvl w:val="0"/>
+          <w:numId w:val="1"/>
+        </w:numPr>
+        <w:spacing w:after="192"/>
+      </w:pPr>
+      <w:r>
+        <w:t xml:space="preserve">As for basic data wrangling, I would like to understand what certain code </w:t>
+      </w:r>
+      <w:proofErr w:type="gramStart"/>
+      <w:r>
+        <w:t>actually do</w:t>
+      </w:r>
+      <w:r>
+        <w:t>es</w:t>
+      </w:r>
+      <w:proofErr w:type="gramEnd"/>
+      <w:r>
+        <w:t xml:space="preserve">. Especially when code is written </w:t>
+      </w:r>
+      <w:r>
+        <w:t>by</w:t>
+      </w:r>
+      <w:r>
+        <w:t xml:space="preserve"> AI, a lot of people seem not to care about what each line means, which sometimes is not necessary. However, especially regarding the </w:t>
+      </w:r>
+      <w:r>
+        <w:t>project</w:t>
+      </w:r>
+      <w:r>
+        <w:t>, I want to be able to precisely explain the code</w:t>
+      </w:r>
+      <w:r>
+        <w:t xml:space="preserve"> and how we worked with the </w:t>
+      </w:r>
+      <w:r>
+        <w:t xml:space="preserve">collected </w:t>
+      </w:r>
+      <w:r>
+        <w:t>data</w:t>
+      </w:r>
+      <w:r>
+        <w:t>.</w:t>
       </w:r>
     </w:p>
     <w:p>
@@ -201,13 +497,13 @@
         <w:rFonts w:ascii="Symbol" w:eastAsiaTheme="minorHAnsi" w:hAnsi="Symbol" w:cs="Calibri" w:hint="default"/>
       </w:rPr>
     </w:lvl>
-    <w:lvl w:ilvl="1" w:tplc="04090003" w:tentative="1">
+    <w:lvl w:ilvl="1" w:tplc="04090003">
       <w:start w:val="1"/>
       <w:numFmt w:val="bullet"/>
       <w:lvlText w:val="o"/>
       <w:lvlJc w:val="left"/>
       <w:pPr>
-        <w:ind w:left="1080" w:hanging="360"/>
+        <w:ind w:left="720" w:hanging="360"/>
       </w:pPr>
       <w:rPr>
         <w:rFonts w:ascii="Courier New" w:hAnsi="Courier New" w:cs="Courier New" w:hint="default"/>

</xml_diff>